<commit_message>
merge: Rol verilerken ,rolun bitme ve deaktiv oldugunun yoxlanmasi duzelisi
</commit_message>
<xml_diff>
--- a/FinNex.UI/wwwroot/Files/Word/Bildir_zam_LATIN.docx
+++ b/FinNex.UI/wwwroot/Files/Word/Bildir_zam_LATIN.docx
@@ -776,42 +776,17 @@
         </w:rPr>
         <w:t xml:space="preserve">   </w:t>
       </w:r>
-      <w:r>
-        <w:rPr>
-          <w:b/>
-          <w:sz w:val="26"/>
-          <w:szCs w:val="26"/>
-          <w:lang w:val="fr-FR"/>
-        </w:rPr>
-        <w:t xml:space="preserve">sssss1  </w:t>
-      </w:r>
-      <w:r>
-        <w:rPr>
-          <w:b/>
-          <w:sz w:val="26"/>
-          <w:szCs w:val="26"/>
-          <w:lang w:val="fr-FR"/>
-        </w:rPr>
-        <w:t>c</w:t>
-      </w:r>
-      <w:r>
-        <w:rPr>
-          <w:b/>
-          <w:sz w:val="26"/>
-          <w:szCs w:val="26"/>
-          <w:lang w:val="fr-FR"/>
-        </w:rPr>
-        <w:t xml:space="preserve">i </w:t>
-      </w:r>
-      <w:r>
-        <w:rPr>
-          <w:b/>
-          <w:sz w:val="26"/>
-          <w:szCs w:val="26"/>
-          <w:lang w:val="fr-FR"/>
-        </w:rPr>
-        <w:t xml:space="preserve"> il</w:t>
-      </w:r>
+      <w:bookmarkStart w:id="0" w:name="_GoBack"/>
+      <w:r>
+        <w:rPr>
+          <w:b/>
+          <w:sz w:val="26"/>
+          <w:szCs w:val="26"/>
+          <w:lang w:val="fr-FR"/>
+        </w:rPr>
+        <w:t>sssss1  ci  il</w:t>
+      </w:r>
+      <w:bookmarkEnd w:id="0"/>
     </w:p>
     <w:p>
       <w:pPr>
@@ -1137,15 +1112,7 @@
           <w:szCs w:val="26"/>
           <w:lang w:val="fr-FR"/>
         </w:rPr>
-        <w:t>«</w:t>
-      </w:r>
-      <w:r>
-        <w:rPr>
-          <w:sz w:val="26"/>
-          <w:szCs w:val="26"/>
-          <w:lang w:val="fr-FR"/>
-        </w:rPr>
-        <w:t>Bank</w:t>
+        <w:t>«Bank</w:t>
       </w:r>
       <w:proofErr w:type="gramEnd"/>
       <w:r>
@@ -1172,16 +1139,118 @@
           <w:szCs w:val="26"/>
           <w:lang w:val="fr-FR"/>
         </w:rPr>
-        <w:t xml:space="preserve"> </w:t>
-      </w:r>
-      <w:r>
-        <w:rPr>
-          <w:sz w:val="26"/>
-          <w:szCs w:val="26"/>
-          <w:lang w:val="fr-FR"/>
-        </w:rPr>
-        <w:t>İran</w:t>
-      </w:r>
+        <w:t xml:space="preserve"> İran» Bakı </w:t>
+      </w:r>
+      <w:proofErr w:type="spellStart"/>
+      <w:r>
+        <w:rPr>
+          <w:sz w:val="26"/>
+          <w:szCs w:val="26"/>
+          <w:lang w:val="fr-FR"/>
+        </w:rPr>
+        <w:t>filialı</w:t>
+      </w:r>
+      <w:proofErr w:type="spellEnd"/>
+      <w:r>
+        <w:rPr>
+          <w:sz w:val="26"/>
+          <w:szCs w:val="26"/>
+          <w:lang w:val="fr-FR"/>
+        </w:rPr>
+        <w:t xml:space="preserve"> </w:t>
+      </w:r>
+      <w:proofErr w:type="spellStart"/>
+      <w:r>
+        <w:rPr>
+          <w:sz w:val="26"/>
+          <w:szCs w:val="26"/>
+          <w:lang w:val="fr-FR"/>
+        </w:rPr>
+        <w:t>arasında</w:t>
+      </w:r>
+      <w:proofErr w:type="spellEnd"/>
+      <w:r>
+        <w:rPr>
+          <w:sz w:val="26"/>
+          <w:szCs w:val="26"/>
+          <w:lang w:val="fr-FR"/>
+        </w:rPr>
+        <w:t xml:space="preserve"> </w:t>
+      </w:r>
+      <w:proofErr w:type="spellStart"/>
+      <w:r>
+        <w:rPr>
+          <w:b/>
+          <w:sz w:val="26"/>
+          <w:szCs w:val="26"/>
+          <w:lang w:val="fr-FR"/>
+        </w:rPr>
+        <w:t>sssssac</w:t>
+      </w:r>
+      <w:proofErr w:type="spellEnd"/>
+      <w:r>
+        <w:rPr>
+          <w:b/>
+          <w:sz w:val="26"/>
+          <w:szCs w:val="26"/>
+          <w:lang w:val="fr-FR"/>
+        </w:rPr>
+        <w:t xml:space="preserve"> il </w:t>
+      </w:r>
+      <w:r>
+        <w:rPr>
+          <w:sz w:val="26"/>
+          <w:szCs w:val="26"/>
+          <w:lang w:val="fr-FR"/>
+        </w:rPr>
+        <w:t xml:space="preserve"> </w:t>
+      </w:r>
+      <w:proofErr w:type="spellStart"/>
+      <w:r>
+        <w:rPr>
+          <w:sz w:val="26"/>
+          <w:szCs w:val="26"/>
+          <w:lang w:val="fr-FR"/>
+        </w:rPr>
+        <w:t>tarixli</w:t>
+      </w:r>
+      <w:proofErr w:type="spellEnd"/>
+      <w:r>
+        <w:rPr>
+          <w:sz w:val="26"/>
+          <w:szCs w:val="26"/>
+          <w:lang w:val="fr-FR"/>
+        </w:rPr>
+        <w:t xml:space="preserve"> «</w:t>
+      </w:r>
+      <w:proofErr w:type="spellStart"/>
+      <w:r>
+        <w:rPr>
+          <w:sz w:val="26"/>
+          <w:szCs w:val="26"/>
+          <w:lang w:val="fr-FR"/>
+        </w:rPr>
+        <w:t>Zaminlik</w:t>
+      </w:r>
+      <w:proofErr w:type="spellEnd"/>
+      <w:r>
+        <w:rPr>
+          <w:sz w:val="26"/>
+          <w:szCs w:val="26"/>
+          <w:lang w:val="fr-FR"/>
+        </w:rPr>
+        <w:t xml:space="preserve"> </w:t>
+      </w:r>
+      <w:proofErr w:type="spellStart"/>
+      <w:r>
+        <w:rPr>
+          <w:sz w:val="26"/>
+          <w:szCs w:val="26"/>
+          <w:lang w:val="fr-FR"/>
+        </w:rPr>
+        <w:t>müqaviləsi</w:t>
+      </w:r>
+      <w:proofErr w:type="spellEnd"/>
       <w:r>
         <w:rPr>
           <w:sz w:val="26"/>
@@ -1190,158 +1259,6 @@
         </w:rPr>
         <w:t xml:space="preserve">» </w:t>
       </w:r>
-      <w:r>
-        <w:rPr>
-          <w:sz w:val="26"/>
-          <w:szCs w:val="26"/>
-          <w:lang w:val="fr-FR"/>
-        </w:rPr>
-        <w:t>Bakı</w:t>
-      </w:r>
-      <w:r>
-        <w:rPr>
-          <w:sz w:val="26"/>
-          <w:szCs w:val="26"/>
-          <w:lang w:val="fr-FR"/>
-        </w:rPr>
-        <w:t xml:space="preserve"> </w:t>
-      </w:r>
-      <w:proofErr w:type="spellStart"/>
-      <w:r>
-        <w:rPr>
-          <w:sz w:val="26"/>
-          <w:szCs w:val="26"/>
-          <w:lang w:val="fr-FR"/>
-        </w:rPr>
-        <w:t>filialı</w:t>
-      </w:r>
-      <w:proofErr w:type="spellEnd"/>
-      <w:r>
-        <w:rPr>
-          <w:sz w:val="26"/>
-          <w:szCs w:val="26"/>
-          <w:lang w:val="fr-FR"/>
-        </w:rPr>
-        <w:t xml:space="preserve"> </w:t>
-      </w:r>
-      <w:proofErr w:type="spellStart"/>
-      <w:r>
-        <w:rPr>
-          <w:sz w:val="26"/>
-          <w:szCs w:val="26"/>
-          <w:lang w:val="fr-FR"/>
-        </w:rPr>
-        <w:t>arasında</w:t>
-      </w:r>
-      <w:proofErr w:type="spellEnd"/>
-      <w:r>
-        <w:rPr>
-          <w:sz w:val="26"/>
-          <w:szCs w:val="26"/>
-          <w:lang w:val="fr-FR"/>
-        </w:rPr>
-        <w:t xml:space="preserve"> </w:t>
-      </w:r>
-      <w:proofErr w:type="spellStart"/>
-      <w:r>
-        <w:rPr>
-          <w:b/>
-          <w:sz w:val="26"/>
-          <w:szCs w:val="26"/>
-          <w:lang w:val="fr-FR"/>
-        </w:rPr>
-        <w:t>sssssac</w:t>
-      </w:r>
-      <w:proofErr w:type="spellEnd"/>
-      <w:r>
-        <w:rPr>
-          <w:b/>
-          <w:sz w:val="26"/>
-          <w:szCs w:val="26"/>
-          <w:lang w:val="fr-FR"/>
-        </w:rPr>
-        <w:t xml:space="preserve"> </w:t>
-      </w:r>
-      <w:r>
-        <w:rPr>
-          <w:b/>
-          <w:sz w:val="26"/>
-          <w:szCs w:val="26"/>
-          <w:lang w:val="fr-FR"/>
-        </w:rPr>
-        <w:t>il</w:t>
-      </w:r>
-      <w:r>
-        <w:rPr>
-          <w:b/>
-          <w:sz w:val="26"/>
-          <w:szCs w:val="26"/>
-          <w:lang w:val="fr-FR"/>
-        </w:rPr>
-        <w:t xml:space="preserve"> </w:t>
-      </w:r>
-      <w:r>
-        <w:rPr>
-          <w:sz w:val="26"/>
-          <w:szCs w:val="26"/>
-          <w:lang w:val="fr-FR"/>
-        </w:rPr>
-        <w:t xml:space="preserve"> </w:t>
-      </w:r>
-      <w:proofErr w:type="spellStart"/>
-      <w:r>
-        <w:rPr>
-          <w:sz w:val="26"/>
-          <w:szCs w:val="26"/>
-          <w:lang w:val="fr-FR"/>
-        </w:rPr>
-        <w:t>tarixli</w:t>
-      </w:r>
-      <w:proofErr w:type="spellEnd"/>
-      <w:r>
-        <w:rPr>
-          <w:sz w:val="26"/>
-          <w:szCs w:val="26"/>
-          <w:lang w:val="fr-FR"/>
-        </w:rPr>
-        <w:t xml:space="preserve"> «</w:t>
-      </w:r>
-      <w:proofErr w:type="spellStart"/>
-      <w:r>
-        <w:rPr>
-          <w:sz w:val="26"/>
-          <w:szCs w:val="26"/>
-          <w:lang w:val="fr-FR"/>
-        </w:rPr>
-        <w:t>Zaminlik</w:t>
-      </w:r>
-      <w:proofErr w:type="spellEnd"/>
-      <w:r>
-        <w:rPr>
-          <w:sz w:val="26"/>
-          <w:szCs w:val="26"/>
-          <w:lang w:val="fr-FR"/>
-        </w:rPr>
-        <w:t xml:space="preserve"> </w:t>
-      </w:r>
-      <w:proofErr w:type="spellStart"/>
-      <w:r>
-        <w:rPr>
-          <w:sz w:val="26"/>
-          <w:szCs w:val="26"/>
-          <w:lang w:val="fr-FR"/>
-        </w:rPr>
-        <w:t>müqaviləsi</w:t>
-      </w:r>
-      <w:proofErr w:type="spellEnd"/>
-      <w:r>
-        <w:rPr>
-          <w:sz w:val="26"/>
-          <w:szCs w:val="26"/>
-          <w:lang w:val="fr-FR"/>
-        </w:rPr>
-        <w:t xml:space="preserve">» </w:t>
-      </w:r>
       <w:proofErr w:type="spellStart"/>
       <w:r>
         <w:rPr>
@@ -1358,23 +1275,7 @@
           <w:szCs w:val="26"/>
           <w:lang w:val="fr-FR"/>
         </w:rPr>
-        <w:t xml:space="preserve">. </w:t>
-      </w:r>
-      <w:r>
-        <w:rPr>
-          <w:sz w:val="26"/>
-          <w:szCs w:val="26"/>
-          <w:lang w:val="fr-FR"/>
-        </w:rPr>
-        <w:t>Bu</w:t>
-      </w:r>
-      <w:r>
-        <w:rPr>
-          <w:sz w:val="26"/>
-          <w:szCs w:val="26"/>
-          <w:lang w:val="fr-FR"/>
-        </w:rPr>
-        <w:t xml:space="preserve"> </w:t>
+        <w:t xml:space="preserve">. Bu </w:t>
       </w:r>
       <w:proofErr w:type="spellStart"/>
       <w:r>
@@ -1437,25 +1338,7 @@
           <w:szCs w:val="26"/>
           <w:lang w:val="fr-FR"/>
         </w:rPr>
-        <w:t>sssss2</w:t>
-      </w:r>
-      <w:r>
-        <w:rPr>
-          <w:b/>
-          <w:sz w:val="26"/>
-          <w:szCs w:val="26"/>
-          <w:lang w:val="fr-FR"/>
-        </w:rPr>
-        <w:t>na</w:t>
-      </w:r>
-      <w:r>
-        <w:rPr>
-          <w:b/>
-          <w:sz w:val="26"/>
-          <w:szCs w:val="26"/>
-          <w:lang w:val="fr-FR"/>
-        </w:rPr>
-        <w:t xml:space="preserve">   </w:t>
+        <w:t xml:space="preserve">sssss2na   </w:t>
       </w:r>
       <w:r>
         <w:rPr>
@@ -1484,23 +1367,7 @@
           <w:szCs w:val="26"/>
           <w:lang w:val="fr-FR"/>
         </w:rPr>
-        <w:t xml:space="preserve"> </w:t>
-      </w:r>
-      <w:r>
-        <w:rPr>
-          <w:sz w:val="26"/>
-          <w:szCs w:val="26"/>
-          <w:lang w:val="fr-FR"/>
-        </w:rPr>
-        <w:t>ay</w:t>
-      </w:r>
-      <w:r>
-        <w:rPr>
-          <w:sz w:val="26"/>
-          <w:szCs w:val="26"/>
-          <w:lang w:val="fr-FR"/>
-        </w:rPr>
-        <w:t xml:space="preserve"> </w:t>
+        <w:t xml:space="preserve"> ay </w:t>
       </w:r>
       <w:proofErr w:type="spellStart"/>
       <w:r>
@@ -2180,8 +2047,6 @@
         </w:rPr>
         <w:t xml:space="preserve">. </w:t>
       </w:r>
-      <w:bookmarkStart w:id="0" w:name="_GoBack"/>
-      <w:bookmarkEnd w:id="0"/>
     </w:p>
     <w:p>
       <w:pPr>
@@ -3021,25 +2886,7 @@
           <w:szCs w:val="26"/>
           <w:lang w:val="fr-FR"/>
         </w:rPr>
-        <w:t>sssss2</w:t>
-      </w:r>
-      <w:r>
-        <w:rPr>
-          <w:b/>
-          <w:sz w:val="26"/>
-          <w:szCs w:val="26"/>
-          <w:lang w:val="fr-FR"/>
-        </w:rPr>
-        <w:t>nun</w:t>
-      </w:r>
-      <w:r>
-        <w:rPr>
-          <w:b/>
-          <w:sz w:val="26"/>
-          <w:szCs w:val="26"/>
-          <w:lang w:val="fr-FR"/>
-        </w:rPr>
-        <w:t xml:space="preserve"> </w:t>
+        <w:t xml:space="preserve">sssss2nun </w:t>
       </w:r>
       <w:proofErr w:type="spellStart"/>
       <w:r>
@@ -3219,15 +3066,7 @@
           <w:szCs w:val="26"/>
           <w:lang w:val="fr-FR"/>
         </w:rPr>
-        <w:t>kr</w:t>
-      </w:r>
-      <w:r>
-        <w:rPr>
-          <w:sz w:val="26"/>
-          <w:szCs w:val="26"/>
-          <w:lang w:val="fr-FR"/>
-        </w:rPr>
-        <w:t>edit</w:t>
+        <w:t>kredit</w:t>
       </w:r>
       <w:proofErr w:type="spellEnd"/>
       <w:r>
@@ -3701,15 +3540,7 @@
           <w:szCs w:val="26"/>
           <w:lang w:val="fr-FR"/>
         </w:rPr>
-        <w:t>k</w:t>
-      </w:r>
-      <w:r>
-        <w:rPr>
-          <w:sz w:val="26"/>
-          <w:szCs w:val="26"/>
-          <w:lang w:val="fr-FR"/>
-        </w:rPr>
-        <w:t>i</w:t>
+        <w:t>ki</w:t>
       </w:r>
       <w:proofErr w:type="spellEnd"/>
       <w:r>
@@ -3763,16 +3594,7 @@
           <w:szCs w:val="26"/>
           <w:lang w:val="fr-FR"/>
         </w:rPr>
-        <w:t>sssss2</w:t>
-      </w:r>
-      <w:r>
-        <w:rPr>
-          <w:b/>
-          <w:sz w:val="26"/>
-          <w:szCs w:val="26"/>
-          <w:lang w:val="fr-FR"/>
-        </w:rPr>
-        <w:t>nun</w:t>
+        <w:t>sssss2nun</w:t>
       </w:r>
       <w:r>
         <w:rPr>
@@ -4017,8 +3839,8 @@
       <w:pPr>
         <w:jc w:val="both"/>
         <w:rPr>
-          <w:sz w:val="26"/>
-          <w:szCs w:val="26"/>
+          <w:sz w:val="24"/>
+          <w:szCs w:val="24"/>
           <w:lang w:val="fr-FR"/>
         </w:rPr>
       </w:pPr>
@@ -4091,41 +3913,25 @@
           <w:szCs w:val="26"/>
           <w:lang w:val="fr-FR"/>
         </w:rPr>
-        <w:t>Respublikası</w:t>
-      </w:r>
-      <w:r>
-        <w:rPr>
-          <w:sz w:val="26"/>
-          <w:szCs w:val="26"/>
-          <w:lang w:val="fr-FR"/>
-        </w:rPr>
-        <w:t>nın</w:t>
-      </w:r>
-      <w:proofErr w:type="spellEnd"/>
-      <w:r>
-        <w:rPr>
-          <w:sz w:val="26"/>
-          <w:szCs w:val="26"/>
-          <w:lang w:val="fr-FR"/>
-        </w:rPr>
-        <w:t xml:space="preserve"> </w:t>
-      </w:r>
-      <w:proofErr w:type="spellStart"/>
-      <w:r>
-        <w:rPr>
-          <w:sz w:val="26"/>
-          <w:szCs w:val="26"/>
-          <w:lang w:val="fr-FR"/>
-        </w:rPr>
-        <w:t>q</w:t>
-      </w:r>
-      <w:r>
-        <w:rPr>
-          <w:sz w:val="26"/>
-          <w:szCs w:val="26"/>
-          <w:lang w:val="fr-FR"/>
-        </w:rPr>
-        <w:t>anunvericiliyinə</w:t>
+        <w:t>Respublikasının</w:t>
+      </w:r>
+      <w:proofErr w:type="spellEnd"/>
+      <w:r>
+        <w:rPr>
+          <w:sz w:val="26"/>
+          <w:szCs w:val="26"/>
+          <w:lang w:val="fr-FR"/>
+        </w:rPr>
+        <w:t xml:space="preserve"> </w:t>
+      </w:r>
+      <w:proofErr w:type="spellStart"/>
+      <w:r>
+        <w:rPr>
+          <w:sz w:val="26"/>
+          <w:szCs w:val="26"/>
+          <w:lang w:val="fr-FR"/>
+        </w:rPr>
+        <w:t>qanunvericiliyinə</w:t>
       </w:r>
       <w:proofErr w:type="spellEnd"/>
       <w:r>
@@ -4247,16 +4053,16 @@
       <w:pPr>
         <w:rPr>
           <w:b/>
-          <w:sz w:val="26"/>
-          <w:szCs w:val="26"/>
+          <w:sz w:val="28"/>
+          <w:szCs w:val="28"/>
           <w:lang w:val="az-Latn-AZ"/>
         </w:rPr>
       </w:pPr>
       <w:r>
         <w:rPr>
           <w:b/>
-          <w:sz w:val="26"/>
-          <w:szCs w:val="26"/>
+          <w:sz w:val="28"/>
+          <w:szCs w:val="28"/>
           <w:lang w:val="az-Latn-AZ"/>
         </w:rPr>
         <w:t>Bank  Melli  İran</w:t>
@@ -4264,17 +4070,17 @@
       <w:r>
         <w:rPr>
           <w:b/>
-          <w:sz w:val="26"/>
-          <w:szCs w:val="26"/>
-          <w:lang w:val="fr-FR"/>
-        </w:rPr>
-        <w:t xml:space="preserve"> </w:t>
-      </w:r>
-      <w:r>
-        <w:rPr>
-          <w:b/>
-          <w:sz w:val="26"/>
-          <w:szCs w:val="26"/>
+          <w:sz w:val="28"/>
+          <w:szCs w:val="28"/>
+          <w:lang w:val="fr-FR"/>
+        </w:rPr>
+        <w:t xml:space="preserve"> </w:t>
+      </w:r>
+      <w:r>
+        <w:rPr>
+          <w:b/>
+          <w:sz w:val="28"/>
+          <w:szCs w:val="28"/>
           <w:lang w:val="az-Latn-AZ"/>
         </w:rPr>
         <w:t xml:space="preserve"> Bakı filialı </w:t>
@@ -4292,11 +4098,29 @@
       <w:r>
         <w:rPr>
           <w:b/>
-          <w:sz w:val="26"/>
-          <w:szCs w:val="26"/>
+          <w:sz w:val="28"/>
+          <w:szCs w:val="28"/>
           <w:lang w:val="az-Latn-AZ"/>
         </w:rPr>
-        <w:t xml:space="preserve"> Problemli İşlər  Departamentinin rəisi:                                                A.İ.İsmayılov</w:t>
+        <w:t xml:space="preserve">Problemli İşlər  Departamentinin rəisi:                </w:t>
+      </w:r>
+      <w:r>
+        <w:rPr>
+          <w:b/>
+          <w:sz w:val="28"/>
+          <w:szCs w:val="28"/>
+          <w:lang w:val="az-Latn-AZ"/>
+        </w:rPr>
+        <w:t xml:space="preserve">                           </w:t>
+      </w:r>
+      <w:r>
+        <w:rPr>
+          <w:b/>
+          <w:sz w:val="28"/>
+          <w:szCs w:val="28"/>
+          <w:lang w:val="az-Latn-AZ"/>
+        </w:rPr>
+        <w:t>A.İ.İsmayılov</w:t>
       </w:r>
     </w:p>
     <w:p>

</xml_diff>